<commit_message>
feat(parity): synchronize all 8 dossiers, protocol agreements, and pitch deck with 'No Committee / Return to Independent Villas' framework (0 fee, refund 28k funds)
</commit_message>
<xml_diff>
--- a/downloads/富宇大境（A2區・6戶）全體區分所有權人管理分流提案申請書暨連署同意名冊.docx
+++ b/downloads/富宇大境（A2區・6戶）全體區分所有權人管理分流提案申請書暨連署同意名冊.docx
@@ -308,7 +308,7 @@
                 <w:color w:val="1A1D20"/>
                 <w:sz w:val="16"/>
               </w:rPr>
-              <w:t>為落實權責相符、促進管理分流與維護整體社區永續營運，富宇大境（A2 區）全體 6 戶區分所有權人謹依《公寓大廈管理條例》第 53 條、第 31 條規定，正式提請管理委員會列入例行會議審議，並依法排入即將召開之區分所有權人會議，審議「富宇大境自富宇大地管理範圍合意分割獨立、成立富宇大境管理委員會及辦理專案資產清算移交案」，請 查照惠復。</w:t>
+              <w:t>為落實權責相符、促進管理分流與維護整體社區永續營運，富宇大境（A2 區）全體 6 戶區分所有權人謹依《公寓大廈管理條例》第 53 條、第 31 條規定，正式提請管理委員會列入例行會議審議，並依法排入即將召開之區分所有權人會議，審議「富宇大境自富宇大地管理組織範圍合意分流退出，回歸自用獨立透天生活，不另成立管理委員會，並由雙方辦理專案款項均分返還 6 戶區權人案」，請 查照惠復。</w:t>
             </w:r>
           </w:p>
         </w:tc>
@@ -391,7 +391,7 @@
           <w:color w:val="1A1D20"/>
           <w:sz w:val="16"/>
         </w:rPr>
-        <w:t>查管委會 115 年 5 月例會議題四及 9 月財報，新光銀行定存單第 2 筆已白紙黑字獨立開立「A2 大境區定存單 NT$ 220,231 元」專單保管；連同起造人富宇建設移交之交屋管理基金（每戶 1 萬元，大境 6 戶共 60,000 元）。本區建請依審計公平原則，於大會決議通過後全額撥交大境管委會公庫專戶，完全不影響大社區剩餘 235 戶原有逾 760 萬元之運營公共基金，達成雙贏。</w:t>
+        <w:t>查管委會 115 年 5 月例會議題四及 9 月財報，新光銀行定存單第 2 筆已白紙黑字獨立開立「A2 大境區定存單 NT$ 220,231 元」專單保管；連同起造人富宇建設移交之交屋管理基金（每戶 1 萬元，大境 6 戶共 60,000 元）。本區建請依審計公平原則，於決議通過後全額均分退還大境 6 戶區權人個人帳戶（每戶退回約 NT$ 47,455 元現金），完全不影響大社區剩餘 235 戶原有逾 760 萬元之運營公共基金，達成雙贏。</w:t>
       </w:r>
     </w:p>
     <w:p>
@@ -471,7 +471,7 @@
           <w:color w:val="1A1D20"/>
           <w:sz w:val="16"/>
         </w:rPr>
-        <w:t>俟大會決議通過後，由雙方管理委員會檢具大會紀錄、修正後規約及分割協議書，共同向主管機關區公所申辦富宇大地戶數變更報備（241 戶變更為 235 戶）及富宇大境獨立管委會備查。</w:t>
+        <w:t>俟大會決議通過後，由雙方管理委員會檢具大會紀錄、修正後規約及分割協議書，共同向主管機關區公所申辦富宇大地戶數變更報備（241 戶變更為 235 戶，A2 棟別排除免設管委會）。</w:t>
       </w:r>
     </w:p>
     <w:p>

</xml_diff>